<commit_message>
feat(tier2/velocidad): cablear «detalle de todos» = copia verbatim (bloque pre-armado)
- KomfIA SQL: «detalle de todos»/«completo»/«(los)críticos» (sin filtro) →
  SELECT * FROM vw_ObservadosBarridoMD (bloque markdown YA armado). Filtrado
  (solo crít/precauc) sigue con vw_ObservadosDetalle. +BarridoMD a allowlist SELECT *.
- KomfIA central: si la respuesta trae DetalleTodosMD → IMPRÍMELA VERBATIM
  (⛔NO reformatees) + resumen corto gerencial (críticos 1º). Filtrado → matriz
  desde vw_ObservadosDetalle. Resumen aligerado.
- Objetivo: que el central NO re-escriba la tabla grande (el cuello de ~2 min).
- Tamaños UTF-16: SQL 7984, central 7979 (ambos ≤8000). View ya validada en SSMS.
- Desplegar: re-pegar central + SQL (⚠ verificar que sobrevivan los '*').

Co-Authored-By: Claude Opus 4.8 <noreply@anthropic.com>
</commit_message>
<xml_diff>
--- a/docs/copilot/KomfIA_SQL.docx
+++ b/docs/copilot/KomfIA_SQL.docx
@@ -433,7 +433,7 @@
           <w:color w:val="1A1A1A"/>
           <w:sz w:val="17"/>
         </w:rPr>
-        <w:t xml:space="preserve">   PASO 2 DETALLE (1 SOLA query, TODOS los comp. juntos; ⛔ NUNCA una query por componente — el central agrupa al pintar): SELECT * FROM vw_ObservadosDetalle WHERE Proyecto LIKE '%…%' [AND Modelo][AND Equipo IN(...)] {F} ORDER BY CASE Estado_General WHEN 'CRITICO' THEN 1 ELSE 2 END, Equipo, Compartimiento. {F}: «solo crít/precauc»=AND Estado_General='CRITICO'/'PRECAUCION'; «precauciones» sin 'solo'=AND NumPrec&gt;0; resto sin 'solo'=vacío. ⛔ NO COLUMNAS ESTÁNDAR.</w:t>
+        <w:t xml:space="preserve">   PASO 2 DETALLE (1 SOLA query; ⛔NUNCA por componente). «todos»/«completo»/«(los)críticos» (sin filtro) → SELECT * FROM vw_ObservadosBarridoMD WHERE Proyecto LIKE '%…%' [AND Modelo] (verbatim, bloque YA armado). Filtrado → SELECT * FROM vw_ObservadosDetalle WHERE Proyecto LIKE '%…%' [AND Modelo][AND Equipo IN(...)] {F} ORDER BY Equipo, Compartimiento. {F}: «solo crít/precauc»=AND Estado_General='CRITICO'/'PRECAUCION'; «precauciones» sin 'solo'=AND NumPrec&gt;0. ⛔ NO COLUMNAS ESTÁNDAR.</w:t>
       </w:r>
     </w:p>
     <w:p>
@@ -467,7 +467,7 @@
           <w:color w:val="1A1A1A"/>
           <w:sz w:val="17"/>
         </w:rPr>
-        <w:t>REGLAS: Solo SELECT/CTE. WITH (NOLOCK). ⛔ USA SOLO vistas vw_* listadas; NUNCA inventes vista/columna (no hay _LP de B/P/V100). TOP N (nunca LIMIT); sin límite TOP 100, en TRIAGE TOP 500. NUNCA SELECT * (salvo vw_ObservadosResumen, vw_ObservadosDetalle, vw_TendenciaElemento, vw_TendenciaGrafico, vw_DiagnosticoEquipo, vw_HistorialFlotaObs) ni Estado_&lt;metal&gt;. Pb/Sn/TBN: sin _LC. NUNCA [FIERRO - LP] contra una vista (eso es de [Eqpcare].[lc]). Equipo = ME.[Code]/columna Equipo (NUNCA EquipmentCode/Id). Compartimiento: TRADUCE el apodo/sigla→keyword y usa LIKE '%KEYWORD%' (⛔ NUNCA la sigla literal: '%MT%' NO matchea→usa '%TRACCION%'). motor diésel/ppal→Compartimiento='MOTOR' (⛔ NO '%MOTOR%'=matchea tracción). Lado→'%LH'/'%RH'. Apodos→«Esquema». Antapaccay→AÑADE Modelo '%980E%' (⛔ NO reemplaza Proyecto; 980E=Antamina tb). NUNCA uses Condicion (1/2/3). Tabla base [Oil].[LaboratoryData] solo si ninguna vista cubre.</w:t>
+        <w:t>REGLAS: Solo SELECT/CTE. WITH (NOLOCK). ⛔ USA SOLO vistas vw_* listadas; NUNCA inventes vista/columna (no hay _LP de B/P/V100). TOP N (nunca LIMIT); sin límite TOP 100, en TRIAGE TOP 500. NUNCA SELECT * (salvo vw_ObservadosBarridoMD, vw_ObservadosResumen, vw_ObservadosDetalle, vw_TendenciaElemento, vw_TendenciaGrafico, vw_DiagnosticoEquipo, vw_HistorialFlotaObs) ni Estado_&lt;metal&gt;. Pb/Sn/TBN: sin _LC. NUNCA [FIERRO - LP] contra una vista (eso es de [Eqpcare].[lc]). Equipo = ME.[Code]/columna Equipo (NUNCA EquipmentCode/Id). Compartimiento: TRADUCE el apodo/sigla→keyword y usa LIKE '%KEYWORD%' (⛔ NUNCA la sigla literal: '%MT%' NO matchea→usa '%TRACCION%'). motor diésel/ppal→Compartimiento='MOTOR' (⛔ NO '%MOTOR%'=matchea tracción). Lado→'%LH'/'%RH'. Apodos→«Esquema». Antapaccay→AÑADE Modelo '%980E%' (⛔ NO reemplaza Proyecto; 980E=Antamina tb). NUNCA uses Condicion (1/2/3). Tabla base [Oil].[LaboratoryData] solo si ninguna vista cubre.</w:t>
       </w:r>
     </w:p>
     <w:p>
@@ -484,7 +484,7 @@
           <w:color w:val="1A1A1A"/>
           <w:sz w:val="17"/>
         </w:rPr>
-        <w:t>FLUJO: genera el SQL con la vista correcta (+ COLUMNAS ESTÁNDAR; barrido = SELECT * de vw_ObservadosResumen/Detalle) → auto-verifica (vista, columnas, DDI) → ejecuta UNA SOLA query con TEST - SQL - V2. Si devuelve filas, entrega el JSON y DETENTE (⛔ NUNCA una 2ª query). Solo si ERROR/BadGateway, reintenta la MISMA 1 vez. EXCEPCIÓN 0 filas SOLO en historial/tendencia de 1 equipo (⛔ NO triage/barrido): LIKE dudoso → 1 DISTINCT Compartimiento y final. ⛔ TRIAGE/BARRIDO 0 filas=ninguno (todos OK)=FINAL: ⛔ NO variantes de Estado_General, NO DISTINCT Proyecto, NO COUNT; entrega y DETENTE.</w:t>
+        <w:t>FLUJO: genera el SQL con la vista correcta (+ COLUMNAS ESTÁNDAR; barrido = SELECT *) → auto-verifica (vista, columnas, DDI) → ejecuta UNA SOLA query con TEST - SQL - V2. Si devuelve filas, entrega el JSON y DETENTE (⛔ NUNCA una 2ª query). Solo si ERROR/BadGateway, reintenta la MISMA 1 vez. EXCEPCIÓN 0 filas SOLO en historial/tendencia de 1 equipo (⛔ NO triage/barrido): LIKE dudoso → 1 DISTINCT Compartimiento y final. ⛔ TRIAGE/BARRIDO 0 filas=ninguno (todos OK)=FINAL: ⛔ NO variantes de Estado_General, NO DISTINCT Proyecto, NO COUNT; entrega y DETENTE.</w:t>
       </w:r>
     </w:p>
     <w:sectPr>

</xml_diff>